<commit_message>
We have final dataframe containing all the varibales available for training,'trend' variable is not included, will need on it
</commit_message>
<xml_diff>
--- a/Docs/BinaryBot_Labeling_Strategy.docx
+++ b/Docs/BinaryBot_Labeling_Strategy.docx
@@ -8,13 +8,18 @@
         <w:jc w:val="center"/>
       </w:pPr>
       <w:r>
-        <w:t>🏷</w:t>
-      </w:r>
-      <w:r>
-        <w:t>️</w:t>
-      </w:r>
-      <w:r>
-        <w:t xml:space="preserve"> BinaryBot Labeling Strategy – For 1m, 3m, 5m Prediction</w:t>
+        <w:t xml:space="preserve"> </w:t>
+      </w:r>
+      <w:r>
+        <w:t xml:space="preserve">🏷️ </w:t>
+      </w:r>
+      <w:proofErr w:type="spellStart"/>
+      <w:r>
+        <w:t>BinaryBot</w:t>
+      </w:r>
+      <w:proofErr w:type="spellEnd"/>
+      <w:r>
+        <w:t xml:space="preserve"> Labeling Strategy – For 1m, 3m, 5m Prediction</w:t>
       </w:r>
     </w:p>
     <w:p>
@@ -25,13 +30,7 @@
         <w:rPr>
           <w:color w:val="0070C0"/>
         </w:rPr>
-        <w:t>🎯</w:t>
-      </w:r>
-      <w:r>
-        <w:rPr>
-          <w:color w:val="0070C0"/>
-        </w:rPr>
-        <w:t xml:space="preserve"> Objective:</w:t>
+        <w:t>🎯 Objective:</w:t>
       </w:r>
     </w:p>
     <w:p>
@@ -47,13 +46,7 @@
         <w:rPr>
           <w:color w:val="FF9900"/>
         </w:rPr>
-        <w:t>🔶</w:t>
-      </w:r>
-      <w:r>
-        <w:rPr>
-          <w:color w:val="FF9900"/>
-        </w:rPr>
-        <w:t xml:space="preserve"> Data Input:</w:t>
+        <w:t>🔶 Data Input:</w:t>
       </w:r>
     </w:p>
     <w:p>
@@ -62,10 +55,7 @@
       </w:r>
       <w:r>
         <w:br/>
-        <w:t xml:space="preserve">- No volume </w:t>
-      </w:r>
-      <w:r>
-        <w:t>used</w:t>
+        <w:t>- No volume used</w:t>
       </w:r>
       <w:r>
         <w:br/>
@@ -73,7 +63,23 @@
       </w:r>
       <w:r>
         <w:br/>
-        <w:t xml:space="preserve">  - EMA(5), EMA(10)</w:t>
+        <w:t xml:space="preserve">  - </w:t>
+      </w:r>
+      <w:proofErr w:type="gramStart"/>
+      <w:r>
+        <w:t>EMA(</w:t>
+      </w:r>
+      <w:proofErr w:type="gramEnd"/>
+      <w:r>
+        <w:t xml:space="preserve">5), </w:t>
+      </w:r>
+      <w:proofErr w:type="gramStart"/>
+      <w:r>
+        <w:t>EMA(</w:t>
+      </w:r>
+      <w:proofErr w:type="gramEnd"/>
+      <w:r>
+        <w:t>10)</w:t>
       </w:r>
       <w:r>
         <w:br/>
@@ -112,27 +118,12 @@
         <w:rPr>
           <w:color w:val="92D050"/>
         </w:rPr>
-        <w:t>🏷</w:t>
-      </w:r>
-      <w:r>
-        <w:rPr>
-          <w:color w:val="92D050"/>
-        </w:rPr>
-        <w:t>️</w:t>
-      </w:r>
-      <w:r>
-        <w:rPr>
-          <w:color w:val="92D050"/>
-        </w:rPr>
-        <w:t xml:space="preserve"> Labeling Rules:</w:t>
+        <w:t>🏷️ Labeling Rules:</w:t>
       </w:r>
     </w:p>
     <w:p>
       <w:r>
-        <w:t>➤</w:t>
-      </w:r>
-      <w:r>
-        <w:t xml:space="preserve"> For 1-Minute Prediction:</w:t>
+        <w:t>➤ For 1-Minute Prediction:</w:t>
       </w:r>
       <w:r>
         <w:br/>
@@ -193,13 +184,7 @@
         <w:rPr>
           <w:color w:val="FF0000"/>
         </w:rPr>
-        <w:t>🧠</w:t>
-      </w:r>
-      <w:r>
-        <w:rPr>
-          <w:color w:val="FF0000"/>
-        </w:rPr>
-        <w:t xml:space="preserve"> Optional Filtering (for clean training samples):</w:t>
+        <w:t>🧠 Optional Filtering (for clean training samples):</w:t>
       </w:r>
     </w:p>
     <w:p>
@@ -208,7 +193,39 @@
       </w:r>
       <w:r>
         <w:br/>
-        <w:t>- EMA(5) &gt; EMA(10) for UP, EMA(5) &lt; EMA(10) for DOWN</w:t>
+        <w:t xml:space="preserve">- </w:t>
+      </w:r>
+      <w:proofErr w:type="gramStart"/>
+      <w:r>
+        <w:t>EMA(</w:t>
+      </w:r>
+      <w:proofErr w:type="gramEnd"/>
+      <w:r>
+        <w:t xml:space="preserve">5) &gt; </w:t>
+      </w:r>
+      <w:proofErr w:type="gramStart"/>
+      <w:r>
+        <w:t>EMA(</w:t>
+      </w:r>
+      <w:proofErr w:type="gramEnd"/>
+      <w:r>
+        <w:t xml:space="preserve">10) for UP, </w:t>
+      </w:r>
+      <w:proofErr w:type="gramStart"/>
+      <w:r>
+        <w:t>EMA(</w:t>
+      </w:r>
+      <w:proofErr w:type="gramEnd"/>
+      <w:r>
+        <w:t xml:space="preserve">5) &lt; </w:t>
+      </w:r>
+      <w:proofErr w:type="gramStart"/>
+      <w:r>
+        <w:t>EMA(</w:t>
+      </w:r>
+      <w:proofErr w:type="gramEnd"/>
+      <w:r>
+        <w:t>10) for DOWN</w:t>
       </w:r>
       <w:r>
         <w:br/>
@@ -242,13 +259,7 @@
         <w:rPr>
           <w:color w:val="5B9BD5"/>
         </w:rPr>
-        <w:t>✅</w:t>
-      </w:r>
-      <w:r>
-        <w:rPr>
-          <w:color w:val="5B9BD5"/>
-        </w:rPr>
-        <w:t xml:space="preserve"> Example Output Table:</w:t>
+        <w:t>✅ Example Output Table:</w:t>
       </w:r>
     </w:p>
     <w:tbl>
@@ -1550,6 +1561,7 @@
           <w:b/>
           <w:bCs/>
         </w:rPr>
+        <w:lastRenderedPageBreak/>
         <w:t>Example:</w:t>
       </w:r>
     </w:p>
@@ -11974,7 +11986,7 @@
       </w:tcPr>
     </w:tblStylePr>
   </w:style>
-  <w:style w:type="table" w:styleId="ColorfulShading">
+  <w:style w:type="table" w:styleId="ColourfulShading">
     <w:name w:val="Colorful Shading"/>
     <w:basedOn w:val="TableNormal"/>
     <w:uiPriority w:val="71"/>
@@ -12089,7 +12101,7 @@
       </w:rPr>
     </w:tblStylePr>
   </w:style>
-  <w:style w:type="table" w:styleId="ColorfulShading-Accent1">
+  <w:style w:type="table" w:styleId="ColourfulShadingAccent1">
     <w:name w:val="Colorful Shading Accent 1"/>
     <w:basedOn w:val="TableNormal"/>
     <w:uiPriority w:val="71"/>
@@ -12204,7 +12216,7 @@
       </w:rPr>
     </w:tblStylePr>
   </w:style>
-  <w:style w:type="table" w:styleId="ColorfulShading-Accent2">
+  <w:style w:type="table" w:styleId="ColourfulShadingAccent2">
     <w:name w:val="Colorful Shading Accent 2"/>
     <w:basedOn w:val="TableNormal"/>
     <w:uiPriority w:val="71"/>
@@ -12319,7 +12331,7 @@
       </w:rPr>
     </w:tblStylePr>
   </w:style>
-  <w:style w:type="table" w:styleId="ColorfulShading-Accent3">
+  <w:style w:type="table" w:styleId="ColourfulShadingAccent3">
     <w:name w:val="Colorful Shading Accent 3"/>
     <w:basedOn w:val="TableNormal"/>
     <w:uiPriority w:val="71"/>
@@ -12424,7 +12436,7 @@
       </w:tcPr>
     </w:tblStylePr>
   </w:style>
-  <w:style w:type="table" w:styleId="ColorfulShading-Accent4">
+  <w:style w:type="table" w:styleId="ColourfulShadingAccent4">
     <w:name w:val="Colorful Shading Accent 4"/>
     <w:basedOn w:val="TableNormal"/>
     <w:uiPriority w:val="71"/>
@@ -12539,7 +12551,7 @@
       </w:rPr>
     </w:tblStylePr>
   </w:style>
-  <w:style w:type="table" w:styleId="ColorfulShading-Accent5">
+  <w:style w:type="table" w:styleId="ColourfulShadingAccent5">
     <w:name w:val="Colorful Shading Accent 5"/>
     <w:basedOn w:val="TableNormal"/>
     <w:uiPriority w:val="71"/>
@@ -12654,7 +12666,7 @@
       </w:rPr>
     </w:tblStylePr>
   </w:style>
-  <w:style w:type="table" w:styleId="ColorfulShading-Accent6">
+  <w:style w:type="table" w:styleId="ColourfulShadingAccent6">
     <w:name w:val="Colorful Shading Accent 6"/>
     <w:basedOn w:val="TableNormal"/>
     <w:uiPriority w:val="71"/>
@@ -12769,7 +12781,7 @@
       </w:rPr>
     </w:tblStylePr>
   </w:style>
-  <w:style w:type="table" w:styleId="ColorfulList">
+  <w:style w:type="table" w:styleId="ColourfulList">
     <w:name w:val="Colorful List"/>
     <w:basedOn w:val="TableNormal"/>
     <w:uiPriority w:val="72"/>
@@ -12848,7 +12860,7 @@
       </w:tcPr>
     </w:tblStylePr>
   </w:style>
-  <w:style w:type="table" w:styleId="ColorfulList-Accent1">
+  <w:style w:type="table" w:styleId="ColourfulListAccent1">
     <w:name w:val="Colorful List Accent 1"/>
     <w:basedOn w:val="TableNormal"/>
     <w:uiPriority w:val="72"/>
@@ -12927,7 +12939,7 @@
       </w:tcPr>
     </w:tblStylePr>
   </w:style>
-  <w:style w:type="table" w:styleId="ColorfulList-Accent2">
+  <w:style w:type="table" w:styleId="ColourfulListAccent2">
     <w:name w:val="Colorful List Accent 2"/>
     <w:basedOn w:val="TableNormal"/>
     <w:uiPriority w:val="72"/>
@@ -13006,7 +13018,7 @@
       </w:tcPr>
     </w:tblStylePr>
   </w:style>
-  <w:style w:type="table" w:styleId="ColorfulList-Accent3">
+  <w:style w:type="table" w:styleId="ColourfulListAccent3">
     <w:name w:val="Colorful List Accent 3"/>
     <w:basedOn w:val="TableNormal"/>
     <w:uiPriority w:val="72"/>
@@ -13085,7 +13097,7 @@
       </w:tcPr>
     </w:tblStylePr>
   </w:style>
-  <w:style w:type="table" w:styleId="ColorfulList-Accent4">
+  <w:style w:type="table" w:styleId="ColourfulListAccent4">
     <w:name w:val="Colorful List Accent 4"/>
     <w:basedOn w:val="TableNormal"/>
     <w:uiPriority w:val="72"/>
@@ -13164,7 +13176,7 @@
       </w:tcPr>
     </w:tblStylePr>
   </w:style>
-  <w:style w:type="table" w:styleId="ColorfulList-Accent5">
+  <w:style w:type="table" w:styleId="ColourfulListAccent5">
     <w:name w:val="Colorful List Accent 5"/>
     <w:basedOn w:val="TableNormal"/>
     <w:uiPriority w:val="72"/>
@@ -13243,7 +13255,7 @@
       </w:tcPr>
     </w:tblStylePr>
   </w:style>
-  <w:style w:type="table" w:styleId="ColorfulList-Accent6">
+  <w:style w:type="table" w:styleId="ColourfulListAccent6">
     <w:name w:val="Colorful List Accent 6"/>
     <w:basedOn w:val="TableNormal"/>
     <w:uiPriority w:val="72"/>
@@ -13322,7 +13334,7 @@
       </w:tcPr>
     </w:tblStylePr>
   </w:style>
-  <w:style w:type="table" w:styleId="ColorfulGrid">
+  <w:style w:type="table" w:styleId="ColourfulGrid">
     <w:name w:val="Colorful Grid"/>
     <w:basedOn w:val="TableNormal"/>
     <w:uiPriority w:val="73"/>
@@ -13395,7 +13407,7 @@
       </w:tcPr>
     </w:tblStylePr>
   </w:style>
-  <w:style w:type="table" w:styleId="ColorfulGrid-Accent1">
+  <w:style w:type="table" w:styleId="ColourfulGridAccent1">
     <w:name w:val="Colorful Grid Accent 1"/>
     <w:basedOn w:val="TableNormal"/>
     <w:uiPriority w:val="73"/>
@@ -13468,7 +13480,7 @@
       </w:tcPr>
     </w:tblStylePr>
   </w:style>
-  <w:style w:type="table" w:styleId="ColorfulGrid-Accent2">
+  <w:style w:type="table" w:styleId="ColourfulGridAccent2">
     <w:name w:val="Colorful Grid Accent 2"/>
     <w:basedOn w:val="TableNormal"/>
     <w:uiPriority w:val="73"/>
@@ -13541,7 +13553,7 @@
       </w:tcPr>
     </w:tblStylePr>
   </w:style>
-  <w:style w:type="table" w:styleId="ColorfulGrid-Accent3">
+  <w:style w:type="table" w:styleId="ColourfulGridAccent3">
     <w:name w:val="Colorful Grid Accent 3"/>
     <w:basedOn w:val="TableNormal"/>
     <w:uiPriority w:val="73"/>
@@ -13614,7 +13626,7 @@
       </w:tcPr>
     </w:tblStylePr>
   </w:style>
-  <w:style w:type="table" w:styleId="ColorfulGrid-Accent4">
+  <w:style w:type="table" w:styleId="ColourfulGridAccent4">
     <w:name w:val="Colorful Grid Accent 4"/>
     <w:basedOn w:val="TableNormal"/>
     <w:uiPriority w:val="73"/>
@@ -13687,7 +13699,7 @@
       </w:tcPr>
     </w:tblStylePr>
   </w:style>
-  <w:style w:type="table" w:styleId="ColorfulGrid-Accent5">
+  <w:style w:type="table" w:styleId="ColourfulGridAccent5">
     <w:name w:val="Colorful Grid Accent 5"/>
     <w:basedOn w:val="TableNormal"/>
     <w:uiPriority w:val="73"/>
@@ -13760,7 +13772,7 @@
       </w:tcPr>
     </w:tblStylePr>
   </w:style>
-  <w:style w:type="table" w:styleId="ColorfulGrid-Accent6">
+  <w:style w:type="table" w:styleId="ColourfulGridAccent6">
     <w:name w:val="Colorful Grid Accent 6"/>
     <w:basedOn w:val="TableNormal"/>
     <w:uiPriority w:val="73"/>
@@ -14180,7 +14192,6 @@
 <ds:datastoreItem xmlns:ds="http://schemas.openxmlformats.org/officeDocument/2006/customXml" ds:itemID="{EF278816-EC6F-A645-907D-7F25AECB1D4A}">
   <ds:schemaRefs>
     <ds:schemaRef ds:uri="http://schemas.openxmlformats.org/officeDocument/2006/bibliography"/>
-    <ds:schemaRef ds:uri="http://www.w3.org/2000/xmlns/"/>
   </ds:schemaRefs>
 </ds:datastoreItem>
 </file>
</xml_diff>

<commit_message>
Updated trend labels and prepared ML Pipeline, ready to execute with correlation matrix for feature elimination and LSTM as a neural network
</commit_message>
<xml_diff>
--- a/Docs/BinaryBot_Labeling_Strategy.docx
+++ b/Docs/BinaryBot_Labeling_Strategy.docx
@@ -852,491 +852,6 @@
     </w:p>
     <w:p>
       <w:pPr>
-        <w:pStyle w:val="NormalWeb"/>
-        <w:numPr>
-          <w:ilvl w:val="0"/>
-          <w:numId w:val="10"/>
-        </w:numPr>
-        <w:divId w:val="1609697482"/>
-      </w:pPr>
-      <w:r>
-        <w:rPr>
-          <w:rStyle w:val="Strong"/>
-        </w:rPr>
-        <w:t>Previous 3 Candle Trend:</w:t>
-      </w:r>
-      <w:r>
-        <w:t xml:space="preserve"> </w:t>
-      </w:r>
-      <w:proofErr w:type="spellStart"/>
-      <w:r>
-        <w:rPr>
-          <w:rFonts w:ascii="Shruti" w:hAnsi="Shruti" w:cs="Shruti"/>
-        </w:rPr>
-        <w:t>તમે</w:t>
-      </w:r>
-      <w:proofErr w:type="spellEnd"/>
-      <w:r>
-        <w:t xml:space="preserve"> </w:t>
-      </w:r>
-      <w:proofErr w:type="spellStart"/>
-      <w:r>
-        <w:rPr>
-          <w:rFonts w:ascii="Shruti" w:hAnsi="Shruti" w:cs="Shruti"/>
-        </w:rPr>
-        <w:t>છેલ્લાં</w:t>
-      </w:r>
-      <w:proofErr w:type="spellEnd"/>
-      <w:r>
-        <w:t xml:space="preserve"> 3 candles (1-minute, 3-minute, etc. timeframe </w:t>
-      </w:r>
-      <w:proofErr w:type="spellStart"/>
-      <w:r>
-        <w:rPr>
-          <w:rFonts w:ascii="Shruti" w:hAnsi="Shruti" w:cs="Shruti"/>
-        </w:rPr>
-        <w:t>મુજબ</w:t>
-      </w:r>
-      <w:proofErr w:type="spellEnd"/>
-      <w:r>
-        <w:t xml:space="preserve">) </w:t>
-      </w:r>
-      <w:proofErr w:type="spellStart"/>
-      <w:r>
-        <w:rPr>
-          <w:rFonts w:ascii="Shruti" w:hAnsi="Shruti" w:cs="Shruti"/>
-        </w:rPr>
-        <w:t>લો</w:t>
-      </w:r>
-      <w:proofErr w:type="spellEnd"/>
-      <w:r>
-        <w:t>.</w:t>
-      </w:r>
-    </w:p>
-    <w:p>
-      <w:pPr>
-        <w:pStyle w:val="NormalWeb"/>
-        <w:numPr>
-          <w:ilvl w:val="0"/>
-          <w:numId w:val="10"/>
-        </w:numPr>
-        <w:divId w:val="1609697482"/>
-      </w:pPr>
-      <w:r>
-        <w:rPr>
-          <w:rStyle w:val="Strong"/>
-        </w:rPr>
-        <w:t>Candle Movement Count:</w:t>
-      </w:r>
-    </w:p>
-    <w:p>
-      <w:pPr>
-        <w:numPr>
-          <w:ilvl w:val="1"/>
-          <w:numId w:val="10"/>
-        </w:numPr>
-        <w:spacing w:before="100" w:beforeAutospacing="1" w:after="100" w:afterAutospacing="1" w:line="240" w:lineRule="auto"/>
-        <w:divId w:val="1609697482"/>
-        <w:rPr>
-          <w:rFonts w:eastAsia="Times New Roman"/>
-        </w:rPr>
-      </w:pPr>
-      <w:proofErr w:type="spellStart"/>
-      <w:r>
-        <w:rPr>
-          <w:rFonts w:ascii="Shruti" w:eastAsia="Times New Roman" w:hAnsi="Shruti" w:cs="Shruti"/>
-        </w:rPr>
-        <w:t>દરેક</w:t>
-      </w:r>
-      <w:proofErr w:type="spellEnd"/>
-      <w:r>
-        <w:rPr>
-          <w:rFonts w:eastAsia="Times New Roman"/>
-        </w:rPr>
-        <w:t xml:space="preserve"> candle </w:t>
-      </w:r>
-      <w:proofErr w:type="spellStart"/>
-      <w:r>
-        <w:rPr>
-          <w:rFonts w:ascii="Shruti" w:eastAsia="Times New Roman" w:hAnsi="Shruti" w:cs="Shruti"/>
-        </w:rPr>
-        <w:t>માટે</w:t>
-      </w:r>
-      <w:proofErr w:type="spellEnd"/>
-      <w:r>
-        <w:rPr>
-          <w:rFonts w:eastAsia="Times New Roman"/>
-        </w:rPr>
-        <w:t xml:space="preserve"> </w:t>
-      </w:r>
-      <w:proofErr w:type="spellStart"/>
-      <w:r>
-        <w:rPr>
-          <w:rFonts w:ascii="Shruti" w:eastAsia="Times New Roman" w:hAnsi="Shruti" w:cs="Shruti"/>
-        </w:rPr>
-        <w:t>જો</w:t>
-      </w:r>
-      <w:proofErr w:type="spellEnd"/>
-      <w:r>
-        <w:rPr>
-          <w:rFonts w:eastAsia="Times New Roman"/>
-        </w:rPr>
-        <w:t xml:space="preserve"> </w:t>
-      </w:r>
-      <w:r>
-        <w:rPr>
-          <w:rStyle w:val="Strong"/>
-          <w:rFonts w:eastAsia="Times New Roman"/>
-        </w:rPr>
-        <w:t>close &gt; open</w:t>
-      </w:r>
-      <w:r>
-        <w:rPr>
-          <w:rFonts w:eastAsia="Times New Roman"/>
-        </w:rPr>
-        <w:t xml:space="preserve"> </w:t>
-      </w:r>
-      <w:proofErr w:type="spellStart"/>
-      <w:r>
-        <w:rPr>
-          <w:rFonts w:ascii="Shruti" w:eastAsia="Times New Roman" w:hAnsi="Shruti" w:cs="Shruti"/>
-        </w:rPr>
-        <w:t>છે</w:t>
-      </w:r>
-      <w:proofErr w:type="spellEnd"/>
-      <w:r>
-        <w:rPr>
-          <w:rFonts w:eastAsia="Times New Roman"/>
-        </w:rPr>
-        <w:t xml:space="preserve"> </w:t>
-      </w:r>
-      <w:proofErr w:type="spellStart"/>
-      <w:r>
-        <w:rPr>
-          <w:rFonts w:ascii="Shruti" w:eastAsia="Times New Roman" w:hAnsi="Shruti" w:cs="Shruti"/>
-        </w:rPr>
-        <w:t>તો</w:t>
-      </w:r>
-      <w:proofErr w:type="spellEnd"/>
-      <w:r>
-        <w:rPr>
-          <w:rFonts w:eastAsia="Times New Roman"/>
-        </w:rPr>
-        <w:t xml:space="preserve"> </w:t>
-      </w:r>
-      <w:proofErr w:type="spellStart"/>
-      <w:r>
-        <w:rPr>
-          <w:rFonts w:ascii="Shruti" w:eastAsia="Times New Roman" w:hAnsi="Shruti" w:cs="Shruti"/>
-        </w:rPr>
-        <w:t>તેને</w:t>
-      </w:r>
-      <w:proofErr w:type="spellEnd"/>
-      <w:r>
-        <w:rPr>
-          <w:rFonts w:eastAsia="Times New Roman"/>
-        </w:rPr>
-        <w:t xml:space="preserve"> </w:t>
-      </w:r>
-      <w:r>
-        <w:rPr>
-          <w:rStyle w:val="Strong"/>
-          <w:rFonts w:eastAsia="Times New Roman"/>
-        </w:rPr>
-        <w:t>UP (+1)</w:t>
-      </w:r>
-      <w:r>
-        <w:rPr>
-          <w:rFonts w:eastAsia="Times New Roman"/>
-        </w:rPr>
-        <w:t xml:space="preserve"> </w:t>
-      </w:r>
-      <w:proofErr w:type="spellStart"/>
-      <w:r>
-        <w:rPr>
-          <w:rFonts w:ascii="Shruti" w:eastAsia="Times New Roman" w:hAnsi="Shruti" w:cs="Shruti"/>
-        </w:rPr>
-        <w:t>ગણો</w:t>
-      </w:r>
-      <w:proofErr w:type="spellEnd"/>
-      <w:r>
-        <w:rPr>
-          <w:rFonts w:eastAsia="Times New Roman"/>
-        </w:rPr>
-        <w:t>.</w:t>
-      </w:r>
-    </w:p>
-    <w:p>
-      <w:pPr>
-        <w:numPr>
-          <w:ilvl w:val="1"/>
-          <w:numId w:val="10"/>
-        </w:numPr>
-        <w:spacing w:before="100" w:beforeAutospacing="1" w:after="100" w:afterAutospacing="1" w:line="240" w:lineRule="auto"/>
-        <w:divId w:val="1609697482"/>
-        <w:rPr>
-          <w:rFonts w:eastAsia="Times New Roman"/>
-        </w:rPr>
-      </w:pPr>
-      <w:proofErr w:type="spellStart"/>
-      <w:r>
-        <w:rPr>
-          <w:rFonts w:ascii="Shruti" w:eastAsia="Times New Roman" w:hAnsi="Shruti" w:cs="Shruti"/>
-        </w:rPr>
-        <w:t>જો</w:t>
-      </w:r>
-      <w:proofErr w:type="spellEnd"/>
-      <w:r>
-        <w:rPr>
-          <w:rFonts w:eastAsia="Times New Roman"/>
-        </w:rPr>
-        <w:t xml:space="preserve"> </w:t>
-      </w:r>
-      <w:r>
-        <w:rPr>
-          <w:rStyle w:val="Strong"/>
-          <w:rFonts w:eastAsia="Times New Roman"/>
-        </w:rPr>
-        <w:t>close &lt; open</w:t>
-      </w:r>
-      <w:r>
-        <w:rPr>
-          <w:rFonts w:eastAsia="Times New Roman"/>
-        </w:rPr>
-        <w:t xml:space="preserve"> </w:t>
-      </w:r>
-      <w:proofErr w:type="spellStart"/>
-      <w:r>
-        <w:rPr>
-          <w:rFonts w:ascii="Shruti" w:eastAsia="Times New Roman" w:hAnsi="Shruti" w:cs="Shruti"/>
-        </w:rPr>
-        <w:t>છે</w:t>
-      </w:r>
-      <w:proofErr w:type="spellEnd"/>
-      <w:r>
-        <w:rPr>
-          <w:rFonts w:eastAsia="Times New Roman"/>
-        </w:rPr>
-        <w:t xml:space="preserve"> </w:t>
-      </w:r>
-      <w:proofErr w:type="spellStart"/>
-      <w:r>
-        <w:rPr>
-          <w:rFonts w:ascii="Shruti" w:eastAsia="Times New Roman" w:hAnsi="Shruti" w:cs="Shruti"/>
-        </w:rPr>
-        <w:t>તો</w:t>
-      </w:r>
-      <w:proofErr w:type="spellEnd"/>
-      <w:r>
-        <w:rPr>
-          <w:rFonts w:eastAsia="Times New Roman"/>
-        </w:rPr>
-        <w:t xml:space="preserve"> </w:t>
-      </w:r>
-      <w:proofErr w:type="spellStart"/>
-      <w:r>
-        <w:rPr>
-          <w:rFonts w:ascii="Shruti" w:eastAsia="Times New Roman" w:hAnsi="Shruti" w:cs="Shruti"/>
-        </w:rPr>
-        <w:t>તેને</w:t>
-      </w:r>
-      <w:proofErr w:type="spellEnd"/>
-      <w:r>
-        <w:rPr>
-          <w:rFonts w:eastAsia="Times New Roman"/>
-        </w:rPr>
-        <w:t xml:space="preserve"> </w:t>
-      </w:r>
-      <w:r>
-        <w:rPr>
-          <w:rStyle w:val="Strong"/>
-          <w:rFonts w:eastAsia="Times New Roman"/>
-        </w:rPr>
-        <w:t>DOWN (-1)</w:t>
-      </w:r>
-      <w:r>
-        <w:rPr>
-          <w:rFonts w:eastAsia="Times New Roman"/>
-        </w:rPr>
-        <w:t xml:space="preserve"> </w:t>
-      </w:r>
-      <w:proofErr w:type="spellStart"/>
-      <w:r>
-        <w:rPr>
-          <w:rFonts w:ascii="Shruti" w:eastAsia="Times New Roman" w:hAnsi="Shruti" w:cs="Shruti"/>
-        </w:rPr>
-        <w:t>ગણો</w:t>
-      </w:r>
-      <w:proofErr w:type="spellEnd"/>
-      <w:r>
-        <w:rPr>
-          <w:rFonts w:eastAsia="Times New Roman"/>
-        </w:rPr>
-        <w:t>.</w:t>
-      </w:r>
-    </w:p>
-    <w:p>
-      <w:pPr>
-        <w:numPr>
-          <w:ilvl w:val="1"/>
-          <w:numId w:val="10"/>
-        </w:numPr>
-        <w:spacing w:before="100" w:beforeAutospacing="1" w:after="100" w:afterAutospacing="1" w:line="240" w:lineRule="auto"/>
-        <w:divId w:val="1609697482"/>
-        <w:rPr>
-          <w:rFonts w:eastAsia="Times New Roman"/>
-        </w:rPr>
-      </w:pPr>
-      <w:proofErr w:type="spellStart"/>
-      <w:r>
-        <w:rPr>
-          <w:rFonts w:eastAsia="Times New Roman"/>
-        </w:rPr>
-        <w:t>Doji</w:t>
-      </w:r>
-      <w:proofErr w:type="spellEnd"/>
-      <w:r>
-        <w:rPr>
-          <w:rFonts w:eastAsia="Times New Roman"/>
-        </w:rPr>
-        <w:t xml:space="preserve"> </w:t>
-      </w:r>
-      <w:proofErr w:type="spellStart"/>
-      <w:r>
-        <w:rPr>
-          <w:rFonts w:ascii="Shruti" w:eastAsia="Times New Roman" w:hAnsi="Shruti" w:cs="Shruti"/>
-        </w:rPr>
-        <w:t>કે</w:t>
-      </w:r>
-      <w:proofErr w:type="spellEnd"/>
-      <w:r>
-        <w:rPr>
-          <w:rFonts w:eastAsia="Times New Roman"/>
-        </w:rPr>
-        <w:t xml:space="preserve"> neutral candle </w:t>
-      </w:r>
-      <w:proofErr w:type="spellStart"/>
-      <w:r>
-        <w:rPr>
-          <w:rFonts w:ascii="Shruti" w:eastAsia="Times New Roman" w:hAnsi="Shruti" w:cs="Shruti"/>
-        </w:rPr>
-        <w:t>હોય</w:t>
-      </w:r>
-      <w:proofErr w:type="spellEnd"/>
-      <w:r>
-        <w:rPr>
-          <w:rFonts w:eastAsia="Times New Roman"/>
-        </w:rPr>
-        <w:t xml:space="preserve"> </w:t>
-      </w:r>
-      <w:proofErr w:type="spellStart"/>
-      <w:r>
-        <w:rPr>
-          <w:rFonts w:ascii="Shruti" w:eastAsia="Times New Roman" w:hAnsi="Shruti" w:cs="Shruti"/>
-        </w:rPr>
-        <w:t>તો</w:t>
-      </w:r>
-      <w:proofErr w:type="spellEnd"/>
-      <w:r>
-        <w:rPr>
-          <w:rFonts w:eastAsia="Times New Roman"/>
-        </w:rPr>
-        <w:t xml:space="preserve"> 0 </w:t>
-      </w:r>
-      <w:proofErr w:type="spellStart"/>
-      <w:r>
-        <w:rPr>
-          <w:rFonts w:ascii="Shruti" w:eastAsia="Times New Roman" w:hAnsi="Shruti" w:cs="Shruti"/>
-        </w:rPr>
-        <w:t>ગણો</w:t>
-      </w:r>
-      <w:proofErr w:type="spellEnd"/>
-      <w:r>
-        <w:rPr>
-          <w:rFonts w:eastAsia="Times New Roman"/>
-        </w:rPr>
-        <w:t xml:space="preserve"> (optional, depend on logic).</w:t>
-      </w:r>
-    </w:p>
-    <w:p>
-      <w:pPr>
-        <w:pStyle w:val="NormalWeb"/>
-        <w:numPr>
-          <w:ilvl w:val="0"/>
-          <w:numId w:val="10"/>
-        </w:numPr>
-        <w:divId w:val="1609697482"/>
-      </w:pPr>
-      <w:r>
-        <w:rPr>
-          <w:rStyle w:val="Strong"/>
-        </w:rPr>
-        <w:t>Summing the Trend:</w:t>
-      </w:r>
-    </w:p>
-    <w:p>
-      <w:pPr>
-        <w:numPr>
-          <w:ilvl w:val="1"/>
-          <w:numId w:val="10"/>
-        </w:numPr>
-        <w:spacing w:before="100" w:beforeAutospacing="1" w:after="100" w:afterAutospacing="1" w:line="240" w:lineRule="auto"/>
-        <w:divId w:val="1609697482"/>
-        <w:rPr>
-          <w:rFonts w:eastAsia="Times New Roman"/>
-        </w:rPr>
-      </w:pPr>
-      <w:proofErr w:type="spellStart"/>
-      <w:r>
-        <w:rPr>
-          <w:rFonts w:ascii="Shruti" w:eastAsia="Times New Roman" w:hAnsi="Shruti" w:cs="Shruti"/>
-        </w:rPr>
-        <w:t>છેલ્લાં</w:t>
-      </w:r>
-      <w:proofErr w:type="spellEnd"/>
-      <w:r>
-        <w:rPr>
-          <w:rFonts w:eastAsia="Times New Roman"/>
-        </w:rPr>
-        <w:t xml:space="preserve"> 3 </w:t>
-      </w:r>
-      <w:proofErr w:type="spellStart"/>
-      <w:r>
-        <w:rPr>
-          <w:rFonts w:eastAsia="Times New Roman"/>
-        </w:rPr>
-        <w:t>candles</w:t>
-      </w:r>
-      <w:r>
-        <w:rPr>
-          <w:rFonts w:ascii="Shruti" w:eastAsia="Times New Roman" w:hAnsi="Shruti" w:cs="Shruti"/>
-        </w:rPr>
-        <w:t>નું</w:t>
-      </w:r>
-      <w:proofErr w:type="spellEnd"/>
-      <w:r>
-        <w:rPr>
-          <w:rFonts w:eastAsia="Times New Roman"/>
-        </w:rPr>
-        <w:t xml:space="preserve"> movement sum </w:t>
-      </w:r>
-      <w:proofErr w:type="spellStart"/>
-      <w:r>
-        <w:rPr>
-          <w:rFonts w:ascii="Shruti" w:eastAsia="Times New Roman" w:hAnsi="Shruti" w:cs="Shruti"/>
-        </w:rPr>
-        <w:t>કરો</w:t>
-      </w:r>
-      <w:proofErr w:type="spellEnd"/>
-      <w:r>
-        <w:rPr>
-          <w:rFonts w:eastAsia="Times New Roman"/>
-        </w:rPr>
-        <w:t>.</w:t>
-      </w:r>
-    </w:p>
-    <w:p>
-      <w:pPr>
         <w:numPr>
           <w:ilvl w:val="1"/>
           <w:numId w:val="10"/>
@@ -1351,199 +866,7 @@
         <w:rPr>
           <w:rFonts w:eastAsia="Times New Roman"/>
         </w:rPr>
-        <w:t xml:space="preserve">Example: </w:t>
-      </w:r>
-    </w:p>
-    <w:p>
-      <w:pPr>
-        <w:numPr>
-          <w:ilvl w:val="2"/>
-          <w:numId w:val="10"/>
-        </w:numPr>
-        <w:spacing w:before="100" w:beforeAutospacing="1" w:after="100" w:afterAutospacing="1" w:line="240" w:lineRule="auto"/>
-        <w:divId w:val="1609697482"/>
-        <w:rPr>
-          <w:rFonts w:eastAsia="Times New Roman"/>
-        </w:rPr>
-      </w:pPr>
-      <w:r>
-        <w:rPr>
-          <w:rFonts w:eastAsia="Times New Roman"/>
-        </w:rPr>
-        <w:t>Candle 1: UP (+1)</w:t>
-      </w:r>
-    </w:p>
-    <w:p>
-      <w:pPr>
-        <w:numPr>
-          <w:ilvl w:val="2"/>
-          <w:numId w:val="10"/>
-        </w:numPr>
-        <w:spacing w:before="100" w:beforeAutospacing="1" w:after="100" w:afterAutospacing="1" w:line="240" w:lineRule="auto"/>
-        <w:divId w:val="1609697482"/>
-        <w:rPr>
-          <w:rFonts w:eastAsia="Times New Roman"/>
-        </w:rPr>
-      </w:pPr>
-      <w:r>
-        <w:rPr>
-          <w:rFonts w:eastAsia="Times New Roman"/>
-        </w:rPr>
-        <w:t>Candle 2: DOWN (-1)</w:t>
-      </w:r>
-    </w:p>
-    <w:p>
-      <w:pPr>
-        <w:numPr>
-          <w:ilvl w:val="2"/>
-          <w:numId w:val="10"/>
-        </w:numPr>
-        <w:spacing w:before="100" w:beforeAutospacing="1" w:after="100" w:afterAutospacing="1" w:line="240" w:lineRule="auto"/>
-        <w:divId w:val="1609697482"/>
-        <w:rPr>
-          <w:rFonts w:eastAsia="Times New Roman"/>
-        </w:rPr>
-      </w:pPr>
-      <w:r>
-        <w:rPr>
-          <w:rFonts w:eastAsia="Times New Roman"/>
-        </w:rPr>
-        <w:t>Candle 3: UP (+1)</w:t>
-      </w:r>
-      <w:r>
-        <w:rPr>
-          <w:rFonts w:eastAsia="Times New Roman"/>
-        </w:rPr>
-        <w:br/>
-        <w:t>→ Sum = +1</w:t>
-      </w:r>
-      <w:r>
-        <w:rPr>
-          <w:rFonts w:eastAsia="Times New Roman"/>
-        </w:rPr>
-        <w:br/>
-        <w:t>→ Final Label = Neutral/Weak UP (as per your custom threshold)</w:t>
-      </w:r>
-    </w:p>
-    <w:p>
-      <w:pPr>
-        <w:pStyle w:val="NormalWeb"/>
-        <w:numPr>
-          <w:ilvl w:val="0"/>
-          <w:numId w:val="10"/>
-        </w:numPr>
-        <w:divId w:val="1609697482"/>
-      </w:pPr>
-      <w:r>
-        <w:rPr>
-          <w:rStyle w:val="Strong"/>
-        </w:rPr>
-        <w:t>Label Assignment:</w:t>
-      </w:r>
-    </w:p>
-    <w:p>
-      <w:pPr>
-        <w:numPr>
-          <w:ilvl w:val="1"/>
-          <w:numId w:val="10"/>
-        </w:numPr>
-        <w:spacing w:before="100" w:beforeAutospacing="1" w:after="100" w:afterAutospacing="1" w:line="240" w:lineRule="auto"/>
-        <w:divId w:val="1609697482"/>
-        <w:rPr>
-          <w:rFonts w:eastAsia="Times New Roman"/>
-        </w:rPr>
-      </w:pPr>
-      <w:r>
-        <w:rPr>
-          <w:rStyle w:val="Strong"/>
-          <w:rFonts w:eastAsia="Times New Roman"/>
-        </w:rPr>
-        <w:t>+2 or +3</w:t>
-      </w:r>
-      <w:r>
-        <w:rPr>
-          <w:rFonts w:eastAsia="Times New Roman"/>
-        </w:rPr>
-        <w:t xml:space="preserve"> → Label as </w:t>
-      </w:r>
-      <w:r>
-        <w:rPr>
-          <w:rStyle w:val="Strong"/>
-          <w:rFonts w:eastAsia="Times New Roman"/>
-        </w:rPr>
-        <w:t>UP (1)</w:t>
-      </w:r>
-    </w:p>
-    <w:p>
-      <w:pPr>
-        <w:numPr>
-          <w:ilvl w:val="1"/>
-          <w:numId w:val="10"/>
-        </w:numPr>
-        <w:spacing w:before="100" w:beforeAutospacing="1" w:after="100" w:afterAutospacing="1" w:line="240" w:lineRule="auto"/>
-        <w:divId w:val="1609697482"/>
-        <w:rPr>
-          <w:rFonts w:eastAsia="Times New Roman"/>
-        </w:rPr>
-      </w:pPr>
-      <w:r>
-        <w:rPr>
-          <w:rStyle w:val="Strong"/>
-          <w:rFonts w:eastAsia="Times New Roman"/>
-        </w:rPr>
-        <w:t>-2 or -3</w:t>
-      </w:r>
-      <w:r>
-        <w:rPr>
-          <w:rFonts w:eastAsia="Times New Roman"/>
-        </w:rPr>
-        <w:t xml:space="preserve"> → Label as </w:t>
-      </w:r>
-      <w:r>
-        <w:rPr>
-          <w:rStyle w:val="Strong"/>
-          <w:rFonts w:eastAsia="Times New Roman"/>
-        </w:rPr>
-        <w:t>DOWN (0)</w:t>
-      </w:r>
-    </w:p>
-    <w:p>
-      <w:pPr>
-        <w:numPr>
-          <w:ilvl w:val="1"/>
-          <w:numId w:val="10"/>
-        </w:numPr>
-        <w:spacing w:before="100" w:beforeAutospacing="1" w:after="100" w:afterAutospacing="1" w:line="240" w:lineRule="auto"/>
-        <w:divId w:val="1609697482"/>
-        <w:rPr>
-          <w:rFonts w:eastAsia="Times New Roman"/>
-        </w:rPr>
-      </w:pPr>
-      <w:r>
-        <w:rPr>
-          <w:rStyle w:val="Strong"/>
-          <w:rFonts w:eastAsia="Times New Roman"/>
-        </w:rPr>
-        <w:t>Anything between (-1 to +1)</w:t>
-      </w:r>
-      <w:r>
-        <w:rPr>
-          <w:rFonts w:eastAsia="Times New Roman"/>
-        </w:rPr>
-        <w:t xml:space="preserve"> → Ignore or label as </w:t>
-      </w:r>
-      <w:r>
-        <w:rPr>
-          <w:rStyle w:val="Strong"/>
-          <w:rFonts w:eastAsia="Times New Roman"/>
-        </w:rPr>
-        <w:t>NEUTRAL</w:t>
-      </w:r>
-      <w:r>
-        <w:rPr>
-          <w:rFonts w:eastAsia="Times New Roman"/>
-        </w:rPr>
-        <w:t xml:space="preserve"> (optional)</w:t>
+        <w:t>c</w:t>
       </w:r>
     </w:p>
     <w:p>
@@ -1561,7 +884,6 @@
           <w:b/>
           <w:bCs/>
         </w:rPr>
-        <w:lastRenderedPageBreak/>
         <w:t>Example:</w:t>
       </w:r>
     </w:p>

</xml_diff>